<commit_message>
docs: ajustar encuadre etico institucional, precision de telemetria en GitHub y estilos jerarquicos Word
</commit_message>
<xml_diff>
--- a/publicacion/manuscrito_difusiones/articulo_tecnico.docx
+++ b/publicacion/manuscrito_difusiones/articulo_tecnico.docx
@@ -32,6 +32,7 @@
     </w:p>
     <w:p>
       <w:pPr>
+        <w:pStyle w:val="Heading2"/>
         <w:spacing w:before="200" w:after="80"/>
         <w:jc w:val="left"/>
       </w:pPr>
@@ -151,6 +152,7 @@
     </w:p>
     <w:p>
       <w:pPr>
+        <w:pStyle w:val="Heading2"/>
         <w:spacing w:before="200" w:after="80"/>
         <w:jc w:val="left"/>
       </w:pPr>
@@ -225,6 +227,7 @@
     </w:p>
     <w:p>
       <w:pPr>
+        <w:pStyle w:val="Heading1"/>
         <w:spacing w:before="280" w:after="120"/>
         <w:jc w:val="center"/>
       </w:pPr>
@@ -482,6 +485,7 @@
     </w:p>
     <w:p>
       <w:pPr>
+        <w:pStyle w:val="Heading1"/>
         <w:spacing w:before="280" w:after="120"/>
         <w:jc w:val="center"/>
       </w:pPr>
@@ -496,6 +500,7 @@
     </w:p>
     <w:p>
       <w:pPr>
+        <w:pStyle w:val="Heading2"/>
         <w:spacing w:before="200" w:after="80"/>
         <w:jc w:val="left"/>
       </w:pPr>
@@ -578,6 +583,7 @@
     </w:p>
     <w:p>
       <w:pPr>
+        <w:pStyle w:val="Heading2"/>
         <w:spacing w:before="200" w:after="80"/>
         <w:jc w:val="left"/>
       </w:pPr>
@@ -743,6 +749,7 @@
     </w:p>
     <w:p>
       <w:pPr>
+        <w:pStyle w:val="Heading2"/>
         <w:spacing w:before="200" w:after="80"/>
         <w:jc w:val="left"/>
       </w:pPr>
@@ -847,6 +854,7 @@
     </w:p>
     <w:p>
       <w:pPr>
+        <w:pStyle w:val="Heading2"/>
         <w:spacing w:before="200" w:after="80"/>
         <w:jc w:val="left"/>
       </w:pPr>
@@ -1286,6 +1294,7 @@
     </w:p>
     <w:p>
       <w:pPr>
+        <w:pStyle w:val="Heading2"/>
         <w:spacing w:before="200" w:after="80"/>
         <w:jc w:val="left"/>
       </w:pPr>
@@ -1436,6 +1445,7 @@
     </w:p>
     <w:p>
       <w:pPr>
+        <w:pStyle w:val="Heading2"/>
         <w:spacing w:before="200" w:after="80"/>
         <w:jc w:val="left"/>
       </w:pPr>
@@ -1577,7 +1587,7 @@
           <w:rFonts w:ascii="Times New Roman" w:hAnsi="Times New Roman"/>
           <w:sz w:val="24"/>
         </w:rPr>
-        <w:t>La identificación de avances individuales se gestionó mediante códigos alfanuméricos temporales y hojas de cotejo observacional en el aula, desvinculadas de nombres personales y destruidas tras consolidar las frecuencias agregadas. Las confirmaciones locales y ejecuciones de integración continua se verificaron directamente en los puestos de trabajo sin almacenar credenciales ni identificadores personales persistentes en repositorios públicos.</w:t>
+        <w:t>La identificación de avances individuales durante el taller se gestionó mediante códigos alfanuméricos temporales en hojas de cotejo observacional en el aula, destruidas tras consolidar las frecuencias agregadas. Para el análisis se registraron exclusivamente frecuencias agregadas de acceso, confirmación y ejecución en GitHub Actions. Aunque la plataforma de control de versiones mostraba identificadores técnicos propios de las cuentas de usuario durante la interacción operativa sincrónica, dichos identificadores no fueron incorporados a la matriz de análisis ni utilizados para asociar resultados o incidencias con participantes individuales.</w:t>
       </w:r>
     </w:p>
     <w:p>
@@ -1594,6 +1604,7 @@
     </w:p>
     <w:p>
       <w:pPr>
+        <w:pStyle w:val="Heading2"/>
         <w:spacing w:before="200" w:after="80"/>
         <w:jc w:val="left"/>
       </w:pPr>
@@ -1615,11 +1626,12 @@
           <w:rFonts w:ascii="Times New Roman" w:hAnsi="Times New Roman"/>
           <w:sz w:val="24"/>
         </w:rPr>
-        <w:t>Al constituir una evaluación técnica de observabilidad y usabilidad de la arquitectura de software en un entorno formativo de prueba, la recolección de información se limitó a métricas técnicas de ejecución en GitHub Actions, telemetría agregada del repositorio plantilla y notas de campo estructuradas sobre incidentes instrumentales en el aula. Al inicio de los encuentros, se comunicó a los asistentes el propósito pedagógico y de indagación técnica de la experiencia, el carácter enteramente voluntario de su intervención y el tratamiento agregado y anónimo de los registros técnicos generados. No se recolectaron datos personales sensibles ni se almacenaron credenciales o identificadores que permitieran asociar desempeños o consultas con identidades individuales, ni se derivaron consecuencias académicas, laborales ni evaluativas para los participantes. Por tratarse de una validación técnica de herramientas y artefactos de software con datos de telemetría agregados y despersonalizados en un entorno de aprendizaje ordinario, la experiencia se encuadra como indagación de riesgo mínimo no sujeta a protocolos bioéticos clínicos.</w:t>
+        <w:t>Al constituir una evaluación técnica de observabilidad y usabilidad de la arquitectura en un taller formativo voluntario, la recolección de datos se limitó a métricas técnicas de ejecución y notas cualitativas estructuradas. Al inicio de los encuentros, se informó oralmente a los asistentes sobre el propósito formativo y analítico de la experiencia, el carácter enteramente voluntario de su intervención y el tratamiento agregado de los registros técnicos generados. No se recolectaron datos personales sensibles ni se derivaron consecuencias académicas, laborales ni evaluativas para los participantes. La experiencia no contó con evaluación previa ni certificación formal de exención por parte de un comité de ética institucional antes de su ejecución, aspecto que se declara abiertamente como limitación del diseño; de ser requerido por el Comité Editorial, se encuentra prevista la tramitación de una constancia de encuadre institucional y no requerimiento bioético ante la autoridad académica correspondiente de la institución acreditante.</w:t>
       </w:r>
     </w:p>
     <w:p>
       <w:pPr>
+        <w:pStyle w:val="Heading1"/>
         <w:spacing w:before="280" w:after="120"/>
         <w:jc w:val="center"/>
       </w:pPr>
@@ -1634,6 +1646,7 @@
     </w:p>
     <w:p>
       <w:pPr>
+        <w:pStyle w:val="Heading2"/>
         <w:spacing w:before="200" w:after="80"/>
         <w:jc w:val="left"/>
       </w:pPr>
@@ -1713,6 +1726,7 @@
     </w:p>
     <w:p>
       <w:pPr>
+        <w:pStyle w:val="Heading2"/>
         <w:spacing w:before="200" w:after="80"/>
         <w:jc w:val="left"/>
       </w:pPr>
@@ -2539,6 +2553,7 @@
     </w:p>
     <w:p>
       <w:pPr>
+        <w:pStyle w:val="Heading2"/>
         <w:spacing w:before="200" w:after="80"/>
         <w:jc w:val="left"/>
       </w:pPr>
@@ -2687,6 +2702,7 @@
     </w:p>
     <w:p>
       <w:pPr>
+        <w:pStyle w:val="Heading1"/>
         <w:spacing w:before="280" w:after="120"/>
         <w:jc w:val="center"/>
       </w:pPr>
@@ -2701,6 +2717,7 @@
     </w:p>
     <w:p>
       <w:pPr>
+        <w:pStyle w:val="Heading2"/>
         <w:spacing w:before="200" w:after="80"/>
         <w:jc w:val="left"/>
       </w:pPr>
@@ -2751,6 +2768,7 @@
     </w:p>
     <w:p>
       <w:pPr>
+        <w:pStyle w:val="Heading2"/>
         <w:spacing w:before="200" w:after="80"/>
         <w:jc w:val="left"/>
       </w:pPr>
@@ -2833,6 +2851,7 @@
     </w:p>
     <w:p>
       <w:pPr>
+        <w:pStyle w:val="Heading2"/>
         <w:spacing w:before="200" w:after="80"/>
         <w:jc w:val="left"/>
       </w:pPr>
@@ -2871,6 +2890,7 @@
     </w:p>
     <w:p>
       <w:pPr>
+        <w:pStyle w:val="Heading2"/>
         <w:spacing w:before="200" w:after="80"/>
         <w:jc w:val="left"/>
       </w:pPr>
@@ -2897,6 +2917,7 @@
     </w:p>
     <w:p>
       <w:pPr>
+        <w:pStyle w:val="Heading2"/>
         <w:spacing w:before="200" w:after="80"/>
         <w:jc w:val="left"/>
       </w:pPr>
@@ -3100,18 +3121,19 @@
           <w:b/>
           <w:sz w:val="24"/>
         </w:rPr>
-        <w:t>Encuadre como validación técnica de bajo riesgo:</w:t>
+        <w:t>Ausencia de dictamen bioético previo:</w:t>
       </w:r>
       <w:r>
         <w:rPr>
           <w:rFonts w:ascii="Times New Roman" w:hAnsi="Times New Roman"/>
           <w:sz w:val="24"/>
         </w:rPr>
-        <w:t xml:space="preserve"> Si bien se garantizó la anonimización, el carácter voluntario y la comunicación previa del propósito formativo y analítico, la experiencia no contó con una evaluación previa ni con una certificación formal de exención emitida por un comité de ética institucional, habiéndose encuadrado la recolección empírica como una evaluación de telemetría y observabilidad de artefactos tecnológicos de riesgo mínimo.</w:t>
+        <w:t xml:space="preserve"> Si bien se garantizó la anonimización, el carácter voluntario y la comunicación previa del propósito formativo y analítico, la experiencia no contó con una evaluación previa ni con una certificación formal de exención emitida por un comité de ética institucional, constituyendo un aspecto a protocolizar formalmente mediante las instancias institucionales correspondientes.</w:t>
       </w:r>
     </w:p>
     <w:p>
       <w:pPr>
+        <w:pStyle w:val="Heading1"/>
         <w:spacing w:before="280" w:after="120"/>
         <w:jc w:val="center"/>
       </w:pPr>
@@ -3322,6 +3344,7 @@
     </w:p>
     <w:p>
       <w:pPr>
+        <w:pStyle w:val="Heading1"/>
         <w:spacing w:before="280" w:after="120"/>
         <w:jc w:val="center"/>
       </w:pPr>
@@ -3336,6 +3359,7 @@
     </w:p>
     <w:p>
       <w:pPr>
+        <w:pStyle w:val="Heading2"/>
         <w:spacing w:before="200" w:after="80"/>
         <w:jc w:val="left"/>
       </w:pPr>
@@ -3362,6 +3386,7 @@
     </w:p>
     <w:p>
       <w:pPr>
+        <w:pStyle w:val="Heading2"/>
         <w:spacing w:before="200" w:after="80"/>
         <w:jc w:val="left"/>
       </w:pPr>
@@ -3388,6 +3413,7 @@
     </w:p>
     <w:p>
       <w:pPr>
+        <w:pStyle w:val="Heading2"/>
         <w:spacing w:before="200" w:after="80"/>
         <w:jc w:val="left"/>
       </w:pPr>
@@ -3397,7 +3423,7 @@
           <w:b/>
           <w:sz w:val="24"/>
         </w:rPr>
-        <w:t>Consideraciones sobre el resguardo de datos y validación técnica</w:t>
+        <w:t>Consideraciones sobre el resguardo de datos y consideraciones éticas</w:t>
       </w:r>
     </w:p>
     <w:p>
@@ -3409,11 +3435,12 @@
           <w:rFonts w:ascii="Times New Roman" w:hAnsi="Times New Roman"/>
           <w:sz w:val="24"/>
         </w:rPr>
-        <w:t>Al constituir una evaluación técnica de observabilidad y usabilidad de la arquitectura de software en un entorno formativo de prueba, la recolección de información se limitó a métricas técnicas de ejecución en GitHub Actions, telemetría agregada del repositorio plantilla y notas de campo estructuradas sobre incidentes instrumentales en el aula. Al inicio de los encuentros, se comunicó a los asistentes el propósito pedagógico y de indagación técnica de la experiencia, el carácter enteramente voluntario de su intervención y el tratamiento agregado y anónimo de los registros técnicos generados. No se recolectaron datos personales sensibles ni se almacenaron credenciales o identificadores que permitieran asociar desempeños o consultas con identidades individuales, ni se derivaron consecuencias académicas, laborales ni evaluativas para los participantes. Por tratarse de una validación técnica de herramientas y artefactos de software con datos de telemetría agregados y despersonalizados en un entorno de aprendizaje ordinario, la experiencia se encuadra como indagación de riesgo mínimo no sujeta a protocolos bioéticos clínicos.</w:t>
+        <w:t>Al constituir una evaluación técnica de observabilidad y usabilidad de la arquitectura en un taller formativo voluntario, la recolección de datos se limitó a métricas técnicas de ejecución y notas cualitativas estructuradas. Al inicio de los encuentros, se informó oralmente a los asistentes sobre el propósito formativo y analítico de la experiencia, el carácter enteramente voluntario de su intervención y el tratamiento agregado de los registros técnicos generados. No se recolectaron datos personales sensibles ni se derivaron consecuencias académicas, laborales ni evaluativas para los participantes. La experiencia no contó con evaluación previa ni certificación formal de exención por parte de un comité de ética institucional antes de su inicio, aspecto que se declara transparentemente como limitación del diseño y para el cual se contempla la presentación de la constancia institucional de encuadre emitida por la autoridad competente de la institución acreditante.</w:t>
       </w:r>
     </w:p>
     <w:p>
       <w:pPr>
+        <w:pStyle w:val="Heading1"/>
         <w:spacing w:before="280" w:after="120"/>
         <w:jc w:val="center"/>
       </w:pPr>
@@ -4106,15 +4133,15 @@
     <w:pPr>
       <w:keepNext/>
       <w:keepLines/>
-      <w:spacing w:before="480" w:after="0"/>
+      <w:spacing w:before="480" w:after="0" w:line="240" w:lineRule="auto"/>
       <w:outlineLvl w:val="0"/>
     </w:pPr>
     <w:rPr>
-      <w:rFonts w:asciiTheme="majorHAnsi" w:eastAsiaTheme="majorEastAsia" w:hAnsiTheme="majorHAnsi" w:cstheme="majorBidi"/>
+      <w:rFonts w:asciiTheme="majorHAnsi" w:eastAsiaTheme="majorEastAsia" w:hAnsiTheme="majorHAnsi" w:cstheme="majorBidi" w:ascii="Times New Roman" w:hAnsi="Times New Roman"/>
       <w:b/>
       <w:bCs/>
-      <w:color w:val="365F91" w:themeColor="accent1" w:themeShade="BF"/>
-      <w:sz w:val="28"/>
+      <w:color w:val="000000"/>
+      <w:sz w:val="24"/>
       <w:szCs w:val="28"/>
     </w:rPr>
   </w:style>
@@ -4130,15 +4157,15 @@
     <w:pPr>
       <w:keepNext/>
       <w:keepLines/>
-      <w:spacing w:before="200" w:after="0"/>
+      <w:spacing w:before="200" w:after="0" w:line="240" w:lineRule="auto"/>
       <w:outlineLvl w:val="1"/>
     </w:pPr>
     <w:rPr>
-      <w:rFonts w:asciiTheme="majorHAnsi" w:eastAsiaTheme="majorEastAsia" w:hAnsiTheme="majorHAnsi" w:cstheme="majorBidi"/>
+      <w:rFonts w:asciiTheme="majorHAnsi" w:eastAsiaTheme="majorEastAsia" w:hAnsiTheme="majorHAnsi" w:cstheme="majorBidi" w:ascii="Times New Roman" w:hAnsi="Times New Roman"/>
       <w:b/>
       <w:bCs/>
-      <w:color w:val="4F81BD" w:themeColor="accent1"/>
-      <w:sz w:val="26"/>
+      <w:color w:val="000000"/>
+      <w:sz w:val="24"/>
       <w:szCs w:val="26"/>
     </w:rPr>
   </w:style>

</xml_diff>

<commit_message>
docs: refinar consideraciones eticas, consentimiento y encuadre institucional segun auditoria
</commit_message>
<xml_diff>
--- a/publicacion/manuscrito_difusiones/articulo_tecnico.docx
+++ b/publicacion/manuscrito_difusiones/articulo_tecnico.docx
@@ -1626,7 +1626,7 @@
           <w:rFonts w:ascii="Times New Roman" w:hAnsi="Times New Roman"/>
           <w:sz w:val="24"/>
         </w:rPr>
-        <w:t>Al constituir una evaluación técnica de observabilidad y usabilidad de la arquitectura en un taller formativo voluntario, la recolección de datos se limitó a métricas técnicas de ejecución y notas cualitativas estructuradas. Al inicio de los encuentros, se informó oralmente a los asistentes sobre el propósito formativo y analítico de la experiencia, el carácter enteramente voluntario de su intervención y el tratamiento agregado de los registros técnicos generados. No se recolectaron datos personales sensibles ni se derivaron consecuencias académicas, laborales ni evaluativas para los participantes. La experiencia no contó con evaluación previa ni certificación formal de exención por parte de un comité de ética institucional antes de su ejecución, aspecto que se declara abiertamente como limitación del diseño; de ser requerido por el Comité Editorial, se encuentra prevista la tramitación de una constancia de encuadre institucional y no requerimiento bioético ante la autoridad académica correspondiente de la institución acreditante.</w:t>
+        <w:t>Al constituir una evaluación técnica de observabilidad y usabilidad de la arquitectura en un taller formativo voluntario, la recolección de datos se limitó a métricas técnicas de ejecución y notas cualitativas estructuradas. Al inicio de los encuentros, se informó oralmente a los asistentes sobre el propósito formativo y analítico de la experiencia, el carácter enteramente voluntario de su intervención y el tratamiento agregado de los registros técnicos generados; no se suscribieron formularios individuales de consentimiento informado ni se recolectaron datos personales sensibles, ni se derivaron consecuencias académicas, laborales ni evaluativas para los participantes. La actividad no contó con evaluación previa ni con una certificación formal de exención emitida por un comité de ética institucional. Esta circunstancia constituye una limitación ética y procedimental del diseño. Antes del envío o publicación definitiva, se solicitará a la autoridad institucional competente un dictamen de encuadre sobre el tratamiento y la difusión de los registros agregados obtenidos.</w:t>
       </w:r>
     </w:p>
     <w:p>
@@ -3121,14 +3121,14 @@
           <w:b/>
           <w:sz w:val="24"/>
         </w:rPr>
-        <w:t>Ausencia de dictamen bioético previo:</w:t>
+        <w:t>Limitación ética y procedimental:</w:t>
       </w:r>
       <w:r>
         <w:rPr>
           <w:rFonts w:ascii="Times New Roman" w:hAnsi="Times New Roman"/>
           <w:sz w:val="24"/>
         </w:rPr>
-        <w:t xml:space="preserve"> Si bien se garantizó la anonimización, el carácter voluntario y la comunicación previa del propósito formativo y analítico, la experiencia no contó con una evaluación previa ni con una certificación formal de exención emitida por un comité de ética institucional, constituyendo un aspecto a protocolizar formalmente mediante las instancias institucionales correspondientes.</w:t>
+        <w:t xml:space="preserve"> Si bien se garantizó la anonimización estricta, la participación voluntaria y la comunicación oral previa de los propósitos formativos y analíticos, la actividad no contó con evaluación previa ni con una certificación formal de exención emitida por un comité de ética institucional. Esta condición constituye una limitación procedimental del diseño. Antes del envío o publicación definitiva, se solicitará a la autoridad institucional competente un dictamen de encuadre sobre el tratamiento y la difusión de los registros agregados obtenidos.</w:t>
       </w:r>
     </w:p>
     <w:p>
@@ -3435,7 +3435,7 @@
           <w:rFonts w:ascii="Times New Roman" w:hAnsi="Times New Roman"/>
           <w:sz w:val="24"/>
         </w:rPr>
-        <w:t>Al constituir una evaluación técnica de observabilidad y usabilidad de la arquitectura en un taller formativo voluntario, la recolección de datos se limitó a métricas técnicas de ejecución y notas cualitativas estructuradas. Al inicio de los encuentros, se informó oralmente a los asistentes sobre el propósito formativo y analítico de la experiencia, el carácter enteramente voluntario de su intervención y el tratamiento agregado de los registros técnicos generados. No se recolectaron datos personales sensibles ni se derivaron consecuencias académicas, laborales ni evaluativas para los participantes. La experiencia no contó con evaluación previa ni certificación formal de exención por parte de un comité de ética institucional antes de su inicio, aspecto que se declara transparentemente como limitación del diseño y para el cual se contempla la presentación de la constancia institucional de encuadre emitida por la autoridad competente de la institución acreditante.</w:t>
+        <w:t>Al constituir una evaluación técnica de observabilidad y usabilidad de la arquitectura en un taller formativo voluntario, la recolección de datos se limitó a métricas técnicas de ejecución y notas cualitativas estructuradas. Al inicio de los encuentros, se informó oralmente a los asistentes sobre el propósito formativo y analítico de la experiencia, el carácter enteramente voluntario de su intervención y el tratamiento agregado de los registros técnicos generados; no se suscribieron formularios individuales de consentimiento informado ni se recolectaron datos personales sensibles, ni se derivaron consecuencias académicas, laborales ni evaluativas para los participantes. La actividad no contó con evaluación previa ni con una certificación formal de exención emitida por un comité de ética institucional. Esta circunstancia constituye una limitación ética y procedimental del diseño. Antes del envío o publicación definitiva, se solicitará a la autoridad institucional competente un dictamen de encuadre sobre el tratamiento y la difusión de los registros agregados obtenidos.</w:t>
       </w:r>
     </w:p>
     <w:p>

</xml_diff>

<commit_message>
docs: afinar precisiones metodologicas sobre participacion (74.3%) y delimitacion sincronica (1.4%)
</commit_message>
<xml_diff>
--- a/publicacion/manuscrito_difusiones/articulo_tecnico.docx
+++ b/publicacion/manuscrito_difusiones/articulo_tecnico.docx
@@ -112,7 +112,7 @@
           <w:rFonts w:ascii="Times New Roman" w:hAnsi="Times New Roman"/>
           <w:sz w:val="24"/>
         </w:rPr>
-        <w:t>, rúbricas analíticas y especificaciones formales de habilidades), pilotaje curricular en asignaturas universitarias de programación y ejecución de un taller intensivo de transferencia de diez horas reloj. La cohorte de validación estuvo constituida por 70 participantes sobre 80 personas inscriptas (tasa de asistencia del 87,5 %), integrada por docentes de ingeniería en informática y estudiantes avanzados y graduados de profesorado y licenciatura en informática educativa. La recolección de datos combinó telemetría del repositorio plantilla, registros de ejecución de integración continua en GitHub Actions y notas de campo estructuradas. Los resultados mostraron una participación mayoritaria en el cuestionario web desacoplado; no obstante, únicamente 1 de los 70 participantes completó de forma autónoma el flujo de integración continua durante el taller. Este hallazgo evidencia una pronunciada brecha de instrumentación técnica (</w:t>
+        <w:t>, rúbricas analíticas y especificaciones formales de habilidades), pilotaje curricular en asignaturas universitarias de programación y ejecución de un taller intensivo de transferencia de diez horas reloj. La cohorte de validación estuvo constituida por 70 participantes sobre 80 personas inscriptas (tasa de asistencia del 87,5 %), integrada por docentes de ingeniería en informática y estudiantes avanzados y graduados de profesorado y licenciatura en informática educativa. La recolección de datos combinó telemetría del repositorio plantilla, registros de ejecución de integración continua en GitHub Actions y notas de campo estructuradas. Los resultados mostraron que 52 de los 70 asistentes (74,3 %) resolvieron el cuestionario web desacoplado; no obstante, únicamente 1 de los 70 participantes completó de forma autónoma el flujo de integración continua durante el horario sincrónico del taller. Este hallazgo evidencia una pronunciada brecha de instrumentación técnica (</w:t>
       </w:r>
       <w:r>
         <w:rPr>
@@ -202,7 +202,7 @@
           <w:rFonts w:ascii="Times New Roman" w:hAnsi="Times New Roman"/>
           <w:sz w:val="24"/>
         </w:rPr>
-        <w:t>, analytical rubrics, and formal teaching skill specifications), curricular piloting in university programming courses, and the delivery of an intensive ten-hour teacher training workshop. The validation cohort comprised 70 attendees out of 80 registered individuals (an 87.5% attendance rate), consisting of computer engineering faculty along with advanced pre-service teachers and recent graduates from educational informatics degree programs. Data collection combined template repository telemetry metrics, continuous integration execution logs on GitHub Actions, and structured qualitative field observation notes. Findings showed majority participation in the decoupled web questionnaire; however, only 1 of the 70 participants autonomously completed the continuous integration pipeline during the workshop. This outcome highlights a pronounced technical tooling gap associated with the operational friction of command-line version control tools. The main limitation lies in the exploratory nature of the study and the absence of standardized baseline measurements. We conclude that the architecture establishes viable operational foundations to guide AI toward supervised formative assistance, though accessible visual interfaces are essential for widespread faculty adoption.</w:t>
+        <w:t>, analytical rubrics, and formal teaching skill specifications), curricular piloting in university programming courses, and the delivery of an intensive ten-hour teacher training workshop. The validation cohort comprised 70 attendees out of 80 registered individuals (an 87.5% attendance rate), consisting of computer engineering faculty along with advanced pre-service teachers and recent graduates from educational informatics degree programs. Data collection combined template repository telemetry metrics, continuous integration execution logs on GitHub Actions, and structured qualitative field observation notes. Findings showed that 52 of the 70 attendees (74.3%) completed the decoupled web questionnaire; however, only 1 of the 70 participants autonomously completed the continuous integration pipeline during the synchronous workshop schedule. This outcome highlights a pronounced technical tooling gap associated with the operational friction of command-line version control tools. The main limitation lies in the exploratory nature of the study and the absence of standardized baseline measurements. We conclude that the architecture establishes viable operational foundations to guide AI toward supervised formative assistance, though accessible visual interfaces are essential for widespread faculty adoption.</w:t>
       </w:r>
     </w:p>
     <w:p>
@@ -2548,7 +2548,7 @@
           <w:rFonts w:ascii="Times New Roman" w:hAnsi="Times New Roman"/>
           <w:sz w:val="24"/>
         </w:rPr>
-        <w:t xml:space="preserve"> durante el horario del taller.</w:t>
+        <w:t xml:space="preserve"> durante el horario sincrónico del taller.</w:t>
       </w:r>
     </w:p>
     <w:p>
@@ -2739,7 +2739,7 @@
           <w:rFonts w:ascii="Times New Roman" w:hAnsi="Times New Roman"/>
           <w:sz w:val="24"/>
         </w:rPr>
-        <w:t>El marcado contraste entre la elevada tasa de asistencia de la cohorte (87,5 %) y la baja culminación sincrónica del flujo automatizado en GitHub Actions (1,4 %) constituye el resultado descriptivo más destacado de la experiencia.</w:t>
+        <w:t>El marcado contraste entre la elevada tasa de asistencia de la cohorte (87,5 %) y la baja culminación del flujo automatizado en GitHub Actions durante el horario sincrónico del taller (1,4 %) constituye el resultado descriptivo más destacado de la experiencia. Conviene precisar que esta métrica refleja estrictamente la finalización autónoma dentro de la ventana horaria presencial del taller, sin indicar que los demás participantes carecieran de la capacidad para completar el proceso en instancias asincrónicas posteriores.</w:t>
       </w:r>
     </w:p>
     <w:p>

</xml_diff>

<commit_message>
feat(a11y): incorporar Alt Text en Figura 1 y encabezado estructural tblHeader en Tabla 1
</commit_message>
<xml_diff>
--- a/publicacion/manuscrito_difusiones/articulo_tecnico.docx
+++ b/publicacion/manuscrito_difusiones/articulo_tecnico.docx
@@ -914,7 +914,7 @@
         <w:drawing>
           <wp:inline xmlns:a="http://schemas.openxmlformats.org/drawingml/2006/main" xmlns:pic="http://schemas.openxmlformats.org/drawingml/2006/picture">
             <wp:extent cx="5472000" cy="3830400"/>
-            <wp:docPr id="1" name="Picture 1"/>
+            <wp:docPr id="1" name="Picture 1" title="Figura 1. Arquitectura sociotécnica MCP y supervisión docente activa" descr="Diagrama de la arquitectura sociotécnica de evaluación continua asistida por agentes, organizada en tres capas: gobernanza contextual, interoperabilidad mediante MCP y supervisión docente."/>
             <wp:cNvGraphicFramePr>
               <a:graphicFrameLocks noChangeAspect="1"/>
             </wp:cNvGraphicFramePr>
@@ -1801,6 +1801,10 @@
         <w:gridCol w:w="2835"/>
       </w:tblGrid>
       <w:tr>
+        <w:trPr>
+          <w:cantSplit/>
+          <w:tblHeader/>
+        </w:trPr>
         <w:tc>
           <w:tcPr>
             <w:tcW w:type="dxa" w:w="2835"/>
@@ -1893,6 +1897,9 @@
         </w:tc>
       </w:tr>
       <w:tr>
+        <w:trPr>
+          <w:cantSplit/>
+        </w:trPr>
         <w:tc>
           <w:tcPr>
             <w:tcW w:type="dxa" w:w="2835"/>
@@ -1970,6 +1977,9 @@
         </w:tc>
       </w:tr>
       <w:tr>
+        <w:trPr>
+          <w:cantSplit/>
+        </w:trPr>
         <w:tc>
           <w:tcPr>
             <w:tcW w:type="dxa" w:w="2835"/>
@@ -2047,6 +2057,9 @@
         </w:tc>
       </w:tr>
       <w:tr>
+        <w:trPr>
+          <w:cantSplit/>
+        </w:trPr>
         <w:tc>
           <w:tcPr>
             <w:tcW w:type="dxa" w:w="2835"/>
@@ -2138,6 +2151,9 @@
         </w:tc>
       </w:tr>
       <w:tr>
+        <w:trPr>
+          <w:cantSplit/>
+        </w:trPr>
         <w:tc>
           <w:tcPr>
             <w:tcW w:type="dxa" w:w="2835"/>
@@ -2229,6 +2245,9 @@
         </w:tc>
       </w:tr>
       <w:tr>
+        <w:trPr>
+          <w:cantSplit/>
+        </w:trPr>
         <w:tc>
           <w:tcPr>
             <w:tcW w:type="dxa" w:w="2835"/>
@@ -2321,6 +2340,9 @@
         </w:tc>
       </w:tr>
       <w:tr>
+        <w:trPr>
+          <w:cantSplit/>
+        </w:trPr>
         <w:tc>
           <w:tcPr>
             <w:tcW w:type="dxa" w:w="2835"/>
@@ -2413,6 +2435,9 @@
         </w:tc>
       </w:tr>
       <w:tr>
+        <w:trPr>
+          <w:cantSplit/>
+        </w:trPr>
         <w:tc>
           <w:tcPr>
             <w:tcW w:type="dxa" w:w="2835"/>

</xml_diff>

<commit_message>
docs: ajustes sustanciales (etica, discusion con literatura, alcance exploratorio, PI1, trazabilidad cualitativa, grupos, terminologia)
</commit_message>
<xml_diff>
--- a/publicacion/manuscrito_difusiones/articulo_tecnico.docx
+++ b/publicacion/manuscrito_difusiones/articulo_tecnico.docx
@@ -54,7 +54,7 @@
           <w:rFonts w:ascii="Times New Roman" w:hAnsi="Times New Roman"/>
           <w:sz w:val="24"/>
         </w:rPr>
-        <w:t>El avance acelerado de los Modelos de Lenguaje de Gran Escala (LLM) plantea desafíos sustanciales para las prácticas de evaluación en la enseñanza universitaria de la programación. Este artículo técnico presenta el diseño, implementación y validación preliminar de una arquitectura sociotécnica basada en el Protocolo de Contexto de Modelo (</w:t>
+        <w:t>El avance acelerado de los Modelos de Lenguaje de Gran Escala (LLM) plantea desafíos sustanciales para las prácticas de evaluación en la enseñanza universitaria de la programación. Este artículo técnico presenta el diseño, implementación y evaluación exploratoria de una arquitectura sociotécnica basada en el Protocolo de Contexto de Modelo (</w:t>
       </w:r>
       <w:r>
         <w:rPr>
@@ -112,7 +112,7 @@
           <w:rFonts w:ascii="Times New Roman" w:hAnsi="Times New Roman"/>
           <w:sz w:val="24"/>
         </w:rPr>
-        <w:t>, rúbricas analíticas y especificaciones formales de habilidades), pilotaje curricular en asignaturas universitarias de programación y ejecución de un taller intensivo de transferencia de diez horas reloj. La cohorte de validación estuvo constituida por 70 participantes sobre 80 personas inscriptas (tasa de asistencia del 87,5 %), integrada por docentes de ingeniería en informática y estudiantes avanzados y graduados de profesorado y licenciatura en informática educativa. La recolección de datos combinó telemetría del repositorio plantilla, registros de ejecución de integración continua en GitHub Actions y notas de campo estructuradas. Los resultados mostraron que 52 de los 70 asistentes (74,3 %) resolvieron el cuestionario web desacoplado; no obstante, únicamente 1 de los 70 participantes completó de forma autónoma el flujo de integración continua durante el horario sincrónico del taller. Este hallazgo evidencia una pronunciada brecha de instrumentación técnica (</w:t>
+        <w:t>, rúbricas analíticas y especificaciones formales de habilidades), pilotaje curricular en asignaturas universitarias de programación y ejecución de un taller intensivo de transferencia de diez horas reloj. La cohorte de validación estuvo constituida por 70 participantes sobre 80 personas inscriptas (tasa de asistencia del 87,5 %), integrada por docentes de ingeniería en informática y estudiantes avanzados y graduados de profesorado y licenciatura en informática educativa. La recolección de datos combinó telemetría del repositorio plantilla, registros de ejecución de integración continua en GitHub Actions y notas de campo estructuradas. Los resultados mostraron que 52 de los 70 asistentes (74,3 %) resolvieron el cuestionario web desacoplado; no obstante, únicamente 1 de los 70 participantes completó de forma autónoma el flujo de integración continua durante el horario sincrónico del taller. Este hallazgo evidencia una pronunciada brecha instrumental (</w:t>
       </w:r>
       <w:r>
         <w:rPr>
@@ -174,7 +174,7 @@
           <w:rFonts w:ascii="Times New Roman" w:hAnsi="Times New Roman"/>
           <w:sz w:val="24"/>
         </w:rPr>
-        <w:t>The rapid advancement of Large Language Models (LLMs) poses substantial challenges for traditional assessment practices in university computer science and programming education. This technical paper presents the design, implementation, and preliminary validation of a sociotechnical architecture based on the open standard Model Context Protocol (MCP) and the active Human-in-the-Loop (HITL) principle to assist continuous formative assessment, analyzing its technical transferability conditions within a teacher professional development context. Methodologically, the research adopted a Design-Based Research (DBR) framework structured across three sequential phases: the design of plain-text contextual governance artifacts (</w:t>
+        <w:t>The rapid advancement of Large Language Models (LLMs) poses substantial challenges for traditional assessment practices in university computer science and programming education. This technical paper presents the design, implementation, and exploratory evaluation of a sociotechnical architecture based on the open standard Model Context Protocol (MCP) and the active Human-in-the-Loop (HITL) principle to assist continuous formative assessment, analyzing its technical transferability conditions within a teacher professional development context. Methodologically, the research adopted a Design-Based Research (DBR) framework structured across three sequential phases: the design of plain-text contextual governance artifacts (</w:t>
       </w:r>
       <w:r>
         <w:rPr>
@@ -380,7 +380,7 @@
           <w:b/>
           <w:sz w:val="24"/>
         </w:rPr>
-        <w:t>diseñar, implementar y validar preliminarmente una arquitectura sociotécnica basada en MCP y supervisión docente activa para asistir la evaluación formativa continua en asignaturas universitarias de programación, así como evaluar las condiciones de viabilidad instrumental y adopción técnica de dicha infraestructura en una experiencia piloto de formación docente</w:t>
+        <w:t>diseñar, implementar y evaluar de manera exploratoria la viabilidad técnica de una arquitectura sociotécnica basada en MCP y supervisión docente activa para asistir la evaluación formativa continua en asignaturas universitarias de programación, así como evaluar las condiciones de viabilidad instrumental y adopción técnica de dicha infraestructura en una experiencia piloto de formación docente</w:t>
       </w:r>
       <w:r>
         <w:rPr>
@@ -583,6 +583,18 @@
     </w:p>
     <w:p>
       <w:pPr>
+        <w:spacing w:line="240" w:lineRule="auto" w:after="120" w:before="0"/>
+      </w:pPr>
+      <w:r>
+        <w:rPr>
+          <w:rFonts w:ascii="Times New Roman" w:hAnsi="Times New Roman"/>
+          <w:sz w:val="24"/>
+        </w:rPr>
+        <w:t>El alcance de la evaluación se circunscribe a la viabilidad técnica de la implementación, la observabilidad del flujo y las condiciones de transferencia instrumental. No se evaluaron la calidad pedagógica de las devoluciones generadas, su concordancia con evaluadores humanos, la mejora del aprendizaje, el ahorro efectivo de tiempo docente ni la reducción mensurable de sesgos.</w:t>
+      </w:r>
+    </w:p>
+    <w:p>
+      <w:pPr>
         <w:pStyle w:val="Heading2"/>
         <w:spacing w:before="200" w:after="80"/>
         <w:jc w:val="left"/>
@@ -717,7 +729,7 @@
           <w:rFonts w:ascii="Times New Roman" w:hAnsi="Times New Roman"/>
           <w:sz w:val="24"/>
         </w:rPr>
-        <w:t xml:space="preserve"> (1° año de Ingeniería en Informática, orientada a modularización algorítmica y arreglos en C++). En esta fase se utilizaron los agentes para generar borradores periciales de prediagnóstico técnico sobre tareas prácticas, los cuales fueron supervisados por el equipo docente a cargo antes de interactuar con los estudiantes. Asimismo, se adaptaron recursos de apoyo complementarios en áreas de sistemas operativos y estructuras de datos para ensayar la versatilidad de las especificaciones.</w:t>
+        <w:t xml:space="preserve"> (1° año de Ingeniería en Informática, orientada a modularización algorítmica y arreglos en C++). En esta fase se utilizaron los agentes para generar borradores periciales de prediagnóstico técnico (entendido como un análisis técnico preliminar de una entrega, sin valor evaluativo definitivo hasta su revisión docente) sobre tareas prácticas, los cuales fueron supervisados por el equipo docente a cargo antes de interactuar con los estudiantes. Asimismo, se adaptaron recursos de apoyo complementarios en áreas de sistemas operativos y estructuras de datos para ensayar la versatilidad de las especificaciones.</w:t>
       </w:r>
     </w:p>
     <w:p>
@@ -1599,7 +1611,7 @@
           <w:rFonts w:ascii="Times New Roman" w:hAnsi="Times New Roman"/>
           <w:sz w:val="24"/>
         </w:rPr>
-        <w:t>El análisis de los registros cuantitativos fue de carácter descriptivo (frecuencias absolutas y porcentajes). Las notas de campo y las consultas se sometieron a un análisis temático cualitativo mediante codificación inductiva abierta, realizada de manera independiente por dos integrantes del equipo investigador sobre el conjunto completo de notas de campo e incidencias registradas durante ambas jornadas; las discrepancias iniciales de codificación se resolvieron por consenso en sesiones de revisión conjunta hasta consolidar una matriz unificada organizada en los tres patrones temáticos informados.</w:t>
+        <w:t>El análisis de los registros cuantitativos fue de carácter descriptivo (frecuencias absolutas y porcentajes). Las notas de campo y las consultas se sometieron a un análisis temático cualitativo (Braun &amp; Clarke, 2006) mediante codificación inductiva abierta, realizada de manera independiente por dos integrantes del equipo investigador sobre el conjunto completo de notas de campo e incidencias registradas durante ambas jornadas; las discrepancias iniciales de codificación se resolvieron por consenso en sesiones de revisión conjunta hasta consolidar una matriz unificada organizada en los tres patrones temáticos informados. Las notas de campo fueron registradas durante las sesiones por integrantes del equipo capacitador; dado el doble rol de investigación y capacitación, la codificación no fue ciega a la situación de aula. Las categorías emergieron durante la codificación y no fueron definidas a priori. Para el conteo se segmentó el registro por episodio: se computó como una incidencia cada bloqueo, consulta o verbalización con unidad temática propia en un momento determinado de la sesión, de modo que un mismo episodio sostenido en el tiempo no se contabilizó más de una vez.</w:t>
       </w:r>
     </w:p>
     <w:p>
@@ -1626,7 +1638,7 @@
           <w:rFonts w:ascii="Times New Roman" w:hAnsi="Times New Roman"/>
           <w:sz w:val="24"/>
         </w:rPr>
-        <w:t>Al constituir una evaluación técnica de observabilidad y usabilidad de la arquitectura en un taller formativo voluntario, la recolección de datos se limitó a métricas técnicas de ejecución y notas cualitativas estructuradas. Al inicio de los encuentros, se informó oralmente a los asistentes sobre el propósito formativo y analítico de la experiencia, el carácter enteramente voluntario de su intervención y el tratamiento agregado de los registros técnicos generados; no se suscribieron formularios individuales de consentimiento informado ni se recolectaron datos personales sensibles, ni se derivaron consecuencias académicas, laborales ni evaluativas para los participantes. La actividad no contó con evaluación previa ni con una certificación formal de exención emitida por un comité de ética institucional. Esta circunstancia constituye una limitación ética y procedimental del diseño. Antes del envío o publicación definitiva, se solicitará a la autoridad institucional competente un dictamen de encuadre sobre el tratamiento y la difusión de los registros agregados obtenidos.</w:t>
+        <w:t>Si bien el propósito central fue evaluar técnicamente la observabilidad y la usabilidad de la arquitectura, el estudio involucró participantes humanos (n = 70) en un taller formativo voluntario, con seguimiento de avances individuales mediante códigos alfanuméricos temporales, observación de conductas y notas de campo. La recolección de datos se limitó a métricas técnicas de ejecución y notas cualitativas estructuradas. Al inicio de los encuentros, se informó oralmente a los asistentes sobre el propósito formativo y analítico de la experiencia, el carácter enteramente voluntario de su intervención y el tratamiento agregado de los registros técnicos generados; no se suscribieron formularios individuales de consentimiento informado ni se recolectaron datos personales sensibles, ni se derivaron consecuencias académicas, laborales ni evaluativas para los participantes. La actividad no contó con evaluación previa ni con una certificación formal de exención emitida por un comité de ética institucional. Esta circunstancia constituye una limitación ética y procedimental del diseño. La determinación escrita de la autoridad institucional competente sobre el encuadre del tratamiento y la difusión de los registros agregados obtenidos será incorporada a esta declaración una vez emitida; hasta entonces, los resultados que involucran participantes humanos deben interpretarse con esta salvedad.</w:t>
       </w:r>
     </w:p>
     <w:p>
@@ -1694,7 +1706,7 @@
           <w:rFonts w:ascii="Times New Roman" w:hAnsi="Times New Roman"/>
           <w:sz w:val="24"/>
         </w:rPr>
-        <w:t xml:space="preserve"> y generando borradores de devolución que citaban números de línea concretos. La formalización mediante habilidades estructuradas favoreció que los prediagnósticos conservaran una estructura común compuesta por: (a) identificación de fortalezas observadas, (b) señalamiento de inconsistencias algorítmicas con cita textual de código y (c) formulación de preguntas orientadoras para la corrección autónoma.</w:t>
+        <w:t xml:space="preserve"> y generando borradores de devolución que citaban números de línea concretos. Durante el pilotaje se observó que los prediagnósticos generados bajo habilidades estructuradas tendían a conservar una organización común compuesta por: (a) identificación de fortalezas observadas, (b) señalamiento de inconsistencias algorítmicas con cita textual de código y (c) formulación de preguntas orientadoras para la corrección autónoma. Esta observación procede del pilotaje exploratorio y debe leerse como evidencia descriptiva: no se acompañó de un recuento sistemático de entregas, prediagnósticos generados ni revisiones docentes.</w:t>
       </w:r>
     </w:p>
     <w:p>
@@ -2752,7 +2764,7 @@
           <w:b/>
           <w:sz w:val="24"/>
         </w:rPr>
-        <w:t>4.1. La brecha de instrumentación (*Tooling Gap*) como factor crítico</w:t>
+        <w:t>4.1. La brecha instrumental (*tooling gap*) como factor crítico</w:t>
       </w:r>
     </w:p>
     <w:p>
@@ -2777,6 +2789,18 @@
           <w:sz w:val="24"/>
         </w:rPr>
         <w:t>Los resultados de este estudio sugieren que la incorporación simultánea de herramientas profesionales de integración continua y control de versiones puede introducir una carga instrumental secundaria que compite con los objetivos pedagógicos centrales del taller. Cuando se intenta capacitar en el diseño de agentes de IA y se exige simultáneamente el dominio de flujos completos de Git y terminal, la fricción instrumental puede dificultar la apropiación pedagógica.</w:t>
+      </w:r>
+    </w:p>
+    <w:p>
+      <w:pPr>
+        <w:spacing w:line="240" w:lineRule="auto" w:after="120" w:before="0"/>
+      </w:pPr>
+      <w:r>
+        <w:rPr>
+          <w:rFonts w:ascii="Times New Roman" w:hAnsi="Times New Roman"/>
+          <w:sz w:val="24"/>
+        </w:rPr>
+        <w:t>Este patrón es coherente con la teoría de la carga cognitiva (Sweller, 1988): cuando una tarea exige coordinar contenidos nuevos (diseño de agentes, rúbricas, especificaciones) con procedimientos instrumentales poco automatizados (autenticación, ramas, confirmaciones de cambios), la memoria de trabajo disponible para el aprendizaje conceptual se reduce. La literatura sobre instrucción también advierte que la guía mínima ante tareas complejas resulta menos eficaz para quienes tienen poca experiencia previa que las secuencias guiadas (Kirschner et al., 2006), y el análisis conceptual de Git ha señalado inconsistencias de diseño que explican parte de las dificultades de usuarios sin experiencia (Perez De Rosso &amp; Jackson, 2013). Estos antecedentes respaldan, de manera interpretativa y no causal, la conveniencia de una alfabetización técnica previa y de interfaces que desacoplen el contenido pedagógico de la consola.</w:t>
       </w:r>
     </w:p>
     <w:p>
@@ -2871,7 +2895,21 @@
           <w:rFonts w:ascii="Times New Roman" w:hAnsi="Times New Roman"/>
           <w:sz w:val="24"/>
         </w:rPr>
-        <w:t>La exigencia protocolizada de vincular cada dictamen a evidencias localizables en el código facilitó la detección docente de afirmaciones erróneas y estableció condiciones operativas orientadas a reducir el riesgo de aceptar evaluaciones no verificadas. Al limitar las herramientas del agente a la inspección pericial mediante MCP, se restringió operativamente la generación directa de soluciones completas y se orientó la respuesta hacia observaciones diagnósticas y preguntas de andamiaje. No obstante, esta consistencia observada requiere ser validada en investigaciones futuras mediante coeficientes estandarizados de concordancia interjueces y diseños cuasiexperimentales controlados.</w:t>
+        <w:t xml:space="preserve">La exigencia protocolizada de vincular cada dictamen a evidencias localizables en el código facilitó la detección docente de afirmaciones erróneas y estableció condiciones operativas orientadas a reducir el riesgo de aceptar evaluaciones no verificadas. Al limitar las herramientas del agente a la inspección pericial mediante MCP, se restringió operativamente la generación directa de soluciones completas y se orientó la respuesta hacia observaciones diagnósticas y preguntas de andamiaje. No obstante, esta consistencia observada requiere ser validada en investigaciones futuras mediante coeficientes estandarizados de concordancia interjueces y diseños cuasiexperimentales controlados. Esta cautela es consistente con las revisiones sobre rúbricas analíticas, que asocian criterios explícitos y descriptores de desempeño con una mayor consistencia de las puntuaciones sin que ello garantice por sí solo la validez de la evaluación (Jonsson &amp; Svingby, 2007); en este trabajo, la formalización de criterios en </w:t>
+      </w:r>
+      <w:r>
+        <w:rPr>
+          <w:rFonts w:ascii="Consolas" w:hAnsi="Consolas"/>
+          <w:sz w:val="21"/>
+        </w:rPr>
+        <w:t>rubrica.md</w:t>
+      </w:r>
+      <w:r>
+        <w:rPr>
+          <w:rFonts w:ascii="Times New Roman" w:hAnsi="Times New Roman"/>
+          <w:sz w:val="24"/>
+        </w:rPr>
+        <w:t xml:space="preserve"> constituye una condición plausible, pero no demostrada, de la consistencia aparente observada.</w:t>
       </w:r>
     </w:p>
     <w:p>
@@ -2898,7 +2936,7 @@
           <w:rFonts w:ascii="Times New Roman" w:hAnsi="Times New Roman"/>
           <w:sz w:val="24"/>
         </w:rPr>
-        <w:t>La experiencia respalda el uso de los agentes como asistentes de diagnóstico preliminar, manteniendo la decisión evaluativa final bajo responsabilidad docente. Durante el pilotaje, el equipo docente percibió que el prediagnóstico asistido disminuía el trabajo rutinario de localización y cotejo de patrones de código; sin embargo, esta percepción no fue cuantificada mediante un protocolo temporal controlado.</w:t>
+        <w:t>La experiencia respalda el uso de los agentes como asistentes de diagnóstico preliminar, manteniendo la decisión evaluativa final bajo responsabilidad docente. Durante el pilotaje, el equipo docente percibió que el prediagnóstico asistido disminuía el trabajo rutinario de localización y cotejo de patrones de código; sin embargo, esta percepción no fue cuantificada mediante un protocolo temporal controlado. Este rol de supervisión coincide con la evidencia de que la eficacia de la retroalimentación depende de su especificidad, su vínculo con la tarea y su orientación hacia la acción (Hattie &amp; Timperley, 2007), atributos que la revisión docente permite verificar antes de comunicarla, y con las advertencias sobre inexactitudes y variabilidad de los modelos generativos en la educación en computación (Denny et al., 2024; Lau &amp; Guo, 2023).</w:t>
       </w:r>
     </w:p>
     <w:p>
@@ -2937,7 +2975,7 @@
           <w:rFonts w:ascii="Times New Roman" w:hAnsi="Times New Roman"/>
           <w:sz w:val="24"/>
         </w:rPr>
-        <w:t>La interacción entre docentes de ingeniería en ejercicio y futuros formadores en informática educativa permitió observar aportes potencialmente complementarios para la innovación educativa. De manera exploratoria, y sin pretensión de comparación sistemática entre grupos, las notas de campo sugirieron diferencias de énfasis: en las intervenciones de participantes vinculados con ingeniería se registraron consultas relacionadas con el control sintáctico y el aislamiento de entornos, mientras que entre los perfiles de formación pedagógica fueron recurrentes las preguntas sobre rúbricas, lenguaje de retroalimentación y accesibilidad. Integrar ambas miradas resulta relevante para evitar tanto el determinismo técnico como la adopción pedagógica ingenua de la IA.</w:t>
+        <w:t>La interacción entre docentes de ingeniería en ejercicio y futuros formadores en informática educativa permitió observar aportes potencialmente complementarios para la innovación educativa. En las notas de campo aparecieron tanto consultas vinculadas con el aislamiento técnico de entornos como preguntas sobre rúbricas, retroalimentación y accesibilidad. Debido al carácter exploratorio del registro y a la ausencia de una comparación sistemática entre grupos, estos énfasis no permiten atribuir patrones diferenciados a cada perfil formativo. No obstante, la presencia de ambos tipos de preocupaciones en una misma instancia formativa sugiere la conveniencia de integrar miradas técnicas y pedagógicas para evitar tanto el determinismo técnico como la adopción pedagógica ingenua de la IA.</w:t>
       </w:r>
     </w:p>
     <w:p>
@@ -3153,7 +3191,34 @@
           <w:rFonts w:ascii="Times New Roman" w:hAnsi="Times New Roman"/>
           <w:sz w:val="24"/>
         </w:rPr>
-        <w:t xml:space="preserve"> Si bien se garantizó la anonimización estricta, la participación voluntaria y la comunicación oral previa de los propósitos formativos y analíticos, la actividad no contó con evaluación previa ni con una certificación formal de exención emitida por un comité de ética institucional. Esta condición constituye una limitación procedimental del diseño. Antes del envío o publicación definitiva, se solicitará a la autoridad institucional competente un dictamen de encuadre sobre el tratamiento y la difusión de los registros agregados obtenidos.</w:t>
+        <w:t xml:space="preserve"> Si bien se garantizó la anonimización estricta, la participación voluntaria y la comunicación oral previa de los propósitos formativos y analíticos, la actividad no contó con evaluación previa ni con una certificación formal de exención emitida por un comité de ética institucional. Esta condición constituye una limitación procedimental del diseño, pendiente de la determinación escrita de la autoridad institucional competente sobre el encuadre del tratamiento y la difusión de los registros agregados obtenidos.</w:t>
+      </w:r>
+    </w:p>
+    <w:p>
+      <w:pPr>
+        <w:spacing w:line="240" w:lineRule="auto" w:after="120" w:before="0"/>
+      </w:pPr>
+      <w:r>
+        <w:rPr>
+          <w:rFonts w:ascii="Times New Roman" w:hAnsi="Times New Roman"/>
+          <w:sz w:val="24"/>
+        </w:rPr>
+        <w:t xml:space="preserve">8. </w:t>
+      </w:r>
+      <w:r>
+        <w:rPr>
+          <w:rFonts w:ascii="Times New Roman" w:hAnsi="Times New Roman"/>
+          <w:b/>
+          <w:sz w:val="24"/>
+        </w:rPr>
+        <w:t>Evidencia exploratoria del pilotaje curricular:</w:t>
+      </w:r>
+      <w:r>
+        <w:rPr>
+          <w:rFonts w:ascii="Times New Roman" w:hAnsi="Times New Roman"/>
+          <w:sz w:val="24"/>
+        </w:rPr>
+        <w:t xml:space="preserve"> La observación sobre la estructura común de los prediagnósticos procede de un pilotaje descriptivo que no registró de manera sistemática la cantidad de entregas analizadas, de borradores generados, de docentes revisores, de afirmaciones erróneas detectadas ni la proporción de borradores aceptados o modificados; en consecuencia, no permite inferir calidad pedagógica, exactitud ni causalidad.</w:t>
       </w:r>
     </w:p>
     <w:p>
@@ -3460,7 +3525,7 @@
           <w:rFonts w:ascii="Times New Roman" w:hAnsi="Times New Roman"/>
           <w:sz w:val="24"/>
         </w:rPr>
-        <w:t>Al constituir una evaluación técnica de observabilidad y usabilidad de la arquitectura en un taller formativo voluntario, la recolección de datos se limitó a métricas técnicas de ejecución y notas cualitativas estructuradas. Al inicio de los encuentros, se informó oralmente a los asistentes sobre el propósito formativo y analítico de la experiencia, el carácter enteramente voluntario de su intervención y el tratamiento agregado de los registros técnicos generados; no se suscribieron formularios individuales de consentimiento informado ni se recolectaron datos personales sensibles, ni se derivaron consecuencias académicas, laborales ni evaluativas para los participantes. La actividad no contó con evaluación previa ni con una certificación formal de exención emitida por un comité de ética institucional. Esta circunstancia constituye una limitación ética y procedimental del diseño. Antes del envío o publicación definitiva, se solicitará a la autoridad institucional competente un dictamen de encuadre sobre el tratamiento y la difusión de los registros agregados obtenidos.</w:t>
+        <w:t>Si bien el propósito central fue evaluar técnicamente la observabilidad y la usabilidad de la arquitectura, el estudio involucró participantes humanos (n = 70) en un taller formativo voluntario, con seguimiento de avances individuales mediante códigos alfanuméricos temporales, observación de conductas y notas de campo. La recolección de datos se limitó a métricas técnicas de ejecución y notas cualitativas estructuradas. Al inicio de los encuentros, se informó oralmente a los asistentes sobre el propósito formativo y analítico de la experiencia, el carácter enteramente voluntario de su intervención y el tratamiento agregado de los registros técnicos generados; no se suscribieron formularios individuales de consentimiento informado ni se recolectaron datos personales sensibles, ni se derivaron consecuencias académicas, laborales ni evaluativas para los participantes. La actividad no contó con evaluación previa ni con una certificación formal de exención emitida por un comité de ética institucional. Esta circunstancia constituye una limitación ética y procedimental del diseño. La determinación escrita de la autoridad institucional competente sobre el encuadre del tratamiento y la difusión de los registros agregados obtenidos será incorporada a esta declaración una vez emitida; hasta entonces, los resultados que involucran participantes humanos deben interpretarse con esta salvedad.</w:t>
       </w:r>
     </w:p>
     <w:p>
@@ -3568,7 +3633,7 @@
           <w:rFonts w:ascii="Times New Roman" w:hAnsi="Times New Roman"/>
           <w:sz w:val="24"/>
         </w:rPr>
-        <w:t xml:space="preserve">Denny, P., Prather, J., Becker, B. A., Finnie-Ansley, J., Blum, A., Luxton-Reilly, A., MacNeil, S., Petersen, A., Reeves, M., &amp; Santos, E. A. (2024). Computing education in the era of generative AI. </w:t>
+        <w:t xml:space="preserve">Braun, V., &amp; Clarke, V. (2006). Using thematic analysis in psychology. </w:t>
       </w:r>
       <w:r>
         <w:rPr>
@@ -3576,14 +3641,14 @@
           <w:i/>
           <w:sz w:val="24"/>
         </w:rPr>
-        <w:t>Communications of the ACM, 67</w:t>
-      </w:r>
-      <w:r>
-        <w:rPr>
-          <w:rFonts w:ascii="Times New Roman" w:hAnsi="Times New Roman"/>
-          <w:sz w:val="24"/>
-        </w:rPr>
-        <w:t>(2), 56-67. https://doi.org/10.1145/3624720</w:t>
+        <w:t>Qualitative Research in Psychology, 3</w:t>
+      </w:r>
+      <w:r>
+        <w:rPr>
+          <w:rFonts w:ascii="Times New Roman" w:hAnsi="Times New Roman"/>
+          <w:sz w:val="24"/>
+        </w:rPr>
+        <w:t>(2), 77-101. https://doi.org/10.1191/1478088706qp063oa</w:t>
       </w:r>
     </w:p>
     <w:p>
@@ -3595,7 +3660,7 @@
           <w:rFonts w:ascii="Times New Roman" w:hAnsi="Times New Roman"/>
           <w:sz w:val="24"/>
         </w:rPr>
-        <w:t xml:space="preserve">Finnie-Ansley, J., Denny, P., Becker, B. A., Luxton-Reilly, A., &amp; Prather, J. (2022). The robots are coming: Exploring the implications of OpenAI Codex on introductory programming. En </w:t>
+        <w:t xml:space="preserve">Denny, P., Prather, J., Becker, B. A., Finnie-Ansley, J., Blum, A., Luxton-Reilly, A., MacNeil, S., Petersen, A., Reeves, M., &amp; Santos, E. A. (2024). Computing education in the era of generative AI. </w:t>
       </w:r>
       <w:r>
         <w:rPr>
@@ -3603,14 +3668,14 @@
           <w:i/>
           <w:sz w:val="24"/>
         </w:rPr>
-        <w:t>Proceedings of the 24th Australasian Computing Education Conference</w:t>
-      </w:r>
-      <w:r>
-        <w:rPr>
-          <w:rFonts w:ascii="Times New Roman" w:hAnsi="Times New Roman"/>
-          <w:sz w:val="24"/>
-        </w:rPr>
-        <w:t xml:space="preserve"> (ACE '22) (pp. 10-19). Association for Computing Machinery. https://doi.org/10.1145/3511861.3511863</w:t>
+        <w:t>Communications of the ACM, 67</w:t>
+      </w:r>
+      <w:r>
+        <w:rPr>
+          <w:rFonts w:ascii="Times New Roman" w:hAnsi="Times New Roman"/>
+          <w:sz w:val="24"/>
+        </w:rPr>
+        <w:t>(2), 56-67. https://doi.org/10.1145/3624720</w:t>
       </w:r>
     </w:p>
     <w:p>
@@ -3622,7 +3687,7 @@
           <w:rFonts w:ascii="Times New Roman" w:hAnsi="Times New Roman"/>
           <w:sz w:val="24"/>
         </w:rPr>
-        <w:t xml:space="preserve">Lau, S., &amp; Guo, P. J. (2023). From "ban it till we understand it" to "resistance is futile": How university programming instructors plan to adapt as more students use AI code generation and explanation tools such as ChatGPT and GitHub Copilot. En </w:t>
+        <w:t xml:space="preserve">Finnie-Ansley, J., Denny, P., Becker, B. A., Luxton-Reilly, A., &amp; Prather, J. (2022). The robots are coming: Exploring the implications of OpenAI Codex on introductory programming. En </w:t>
       </w:r>
       <w:r>
         <w:rPr>
@@ -3630,14 +3695,14 @@
           <w:i/>
           <w:sz w:val="24"/>
         </w:rPr>
-        <w:t>Proceedings of the 2023 ACM Conference on International Computing Education Research V. 1</w:t>
-      </w:r>
-      <w:r>
-        <w:rPr>
-          <w:rFonts w:ascii="Times New Roman" w:hAnsi="Times New Roman"/>
-          <w:sz w:val="24"/>
-        </w:rPr>
-        <w:t xml:space="preserve"> (ICER '23) (pp. 106-121). Association for Computing Machinery. https://doi.org/10.1145/3568813.3600138</w:t>
+        <w:t>Proceedings of the 24th Australasian Computing Education Conference</w:t>
+      </w:r>
+      <w:r>
+        <w:rPr>
+          <w:rFonts w:ascii="Times New Roman" w:hAnsi="Times New Roman"/>
+          <w:sz w:val="24"/>
+        </w:rPr>
+        <w:t xml:space="preserve"> (ACE '22) (pp. 10-19). Association for Computing Machinery. https://doi.org/10.1145/3511861.3511863</w:t>
       </w:r>
     </w:p>
     <w:p>
@@ -3649,7 +3714,7 @@
           <w:rFonts w:ascii="Times New Roman" w:hAnsi="Times New Roman"/>
           <w:sz w:val="24"/>
         </w:rPr>
-        <w:t xml:space="preserve">OWASP. (2025). </w:t>
+        <w:t xml:space="preserve">Hattie, J., &amp; Timperley, H. (2007). The power of feedback. </w:t>
       </w:r>
       <w:r>
         <w:rPr>
@@ -3657,14 +3722,14 @@
           <w:i/>
           <w:sz w:val="24"/>
         </w:rPr>
-        <w:t>Model Context Protocol (MCP) Security Cheat Sheet</w:t>
-      </w:r>
-      <w:r>
-        <w:rPr>
-          <w:rFonts w:ascii="Times New Roman" w:hAnsi="Times New Roman"/>
-          <w:sz w:val="24"/>
-        </w:rPr>
-        <w:t>. Open Web Application Security Project. https://cheatsheetseries.owasp.org/cheatsheets/MCP_Security_Cheat_Sheet.html</w:t>
+        <w:t>Review of Educational Research, 77</w:t>
+      </w:r>
+      <w:r>
+        <w:rPr>
+          <w:rFonts w:ascii="Times New Roman" w:hAnsi="Times New Roman"/>
+          <w:sz w:val="24"/>
+        </w:rPr>
+        <w:t>(1), 81-112. https://doi.org/10.3102/003465430298487</w:t>
       </w:r>
     </w:p>
     <w:p>
@@ -3676,6 +3741,141 @@
           <w:rFonts w:ascii="Times New Roman" w:hAnsi="Times New Roman"/>
           <w:sz w:val="24"/>
         </w:rPr>
+        <w:t xml:space="preserve">Jonsson, A., &amp; Svingby, G. (2007). The use of scoring rubrics: Reliability, validity and educational consequences. </w:t>
+      </w:r>
+      <w:r>
+        <w:rPr>
+          <w:rFonts w:ascii="Times New Roman" w:hAnsi="Times New Roman"/>
+          <w:i/>
+          <w:sz w:val="24"/>
+        </w:rPr>
+        <w:t>Educational Research Review, 2</w:t>
+      </w:r>
+      <w:r>
+        <w:rPr>
+          <w:rFonts w:ascii="Times New Roman" w:hAnsi="Times New Roman"/>
+          <w:sz w:val="24"/>
+        </w:rPr>
+        <w:t>(2), 130-144. https://doi.org/10.1016/j.edurev.2007.05.002</w:t>
+      </w:r>
+    </w:p>
+    <w:p>
+      <w:pPr>
+        <w:spacing w:line="240" w:lineRule="auto" w:after="120" w:before="0"/>
+      </w:pPr>
+      <w:r>
+        <w:rPr>
+          <w:rFonts w:ascii="Times New Roman" w:hAnsi="Times New Roman"/>
+          <w:sz w:val="24"/>
+        </w:rPr>
+        <w:t xml:space="preserve">Kirschner, P. A., Sweller, J., &amp; Clark, R. E. (2006). Why minimal guidance during instruction does not work: An analysis of the failure of constructivist, discovery, problem-based, experiential, and inquiry-based teaching. </w:t>
+      </w:r>
+      <w:r>
+        <w:rPr>
+          <w:rFonts w:ascii="Times New Roman" w:hAnsi="Times New Roman"/>
+          <w:i/>
+          <w:sz w:val="24"/>
+        </w:rPr>
+        <w:t>Educational Psychologist, 41</w:t>
+      </w:r>
+      <w:r>
+        <w:rPr>
+          <w:rFonts w:ascii="Times New Roman" w:hAnsi="Times New Roman"/>
+          <w:sz w:val="24"/>
+        </w:rPr>
+        <w:t>(2), 75-86. https://doi.org/10.1207/s15326985ep4102_1</w:t>
+      </w:r>
+    </w:p>
+    <w:p>
+      <w:pPr>
+        <w:spacing w:line="240" w:lineRule="auto" w:after="120" w:before="0"/>
+      </w:pPr>
+      <w:r>
+        <w:rPr>
+          <w:rFonts w:ascii="Times New Roman" w:hAnsi="Times New Roman"/>
+          <w:sz w:val="24"/>
+        </w:rPr>
+        <w:t xml:space="preserve">Lau, S., &amp; Guo, P. J. (2023). From "ban it till we understand it" to "resistance is futile": How university programming instructors plan to adapt as more students use AI code generation and explanation tools such as ChatGPT and GitHub Copilot. En </w:t>
+      </w:r>
+      <w:r>
+        <w:rPr>
+          <w:rFonts w:ascii="Times New Roman" w:hAnsi="Times New Roman"/>
+          <w:i/>
+          <w:sz w:val="24"/>
+        </w:rPr>
+        <w:t>Proceedings of the 2023 ACM Conference on International Computing Education Research V. 1</w:t>
+      </w:r>
+      <w:r>
+        <w:rPr>
+          <w:rFonts w:ascii="Times New Roman" w:hAnsi="Times New Roman"/>
+          <w:sz w:val="24"/>
+        </w:rPr>
+        <w:t xml:space="preserve"> (ICER '23) (pp. 106-121). Association for Computing Machinery. https://doi.org/10.1145/3568813.3600138</w:t>
+      </w:r>
+    </w:p>
+    <w:p>
+      <w:pPr>
+        <w:spacing w:line="240" w:lineRule="auto" w:after="120" w:before="0"/>
+      </w:pPr>
+      <w:r>
+        <w:rPr>
+          <w:rFonts w:ascii="Times New Roman" w:hAnsi="Times New Roman"/>
+          <w:sz w:val="24"/>
+        </w:rPr>
+        <w:t xml:space="preserve">OWASP. (2025). </w:t>
+      </w:r>
+      <w:r>
+        <w:rPr>
+          <w:rFonts w:ascii="Times New Roman" w:hAnsi="Times New Roman"/>
+          <w:i/>
+          <w:sz w:val="24"/>
+        </w:rPr>
+        <w:t>Model Context Protocol (MCP) Security Cheat Sheet</w:t>
+      </w:r>
+      <w:r>
+        <w:rPr>
+          <w:rFonts w:ascii="Times New Roman" w:hAnsi="Times New Roman"/>
+          <w:sz w:val="24"/>
+        </w:rPr>
+        <w:t>. Open Web Application Security Project. https://cheatsheetseries.owasp.org/cheatsheets/MCP_Security_Cheat_Sheet.html</w:t>
+      </w:r>
+    </w:p>
+    <w:p>
+      <w:pPr>
+        <w:spacing w:line="240" w:lineRule="auto" w:after="120" w:before="0"/>
+      </w:pPr>
+      <w:r>
+        <w:rPr>
+          <w:rFonts w:ascii="Times New Roman" w:hAnsi="Times New Roman"/>
+          <w:sz w:val="24"/>
+        </w:rPr>
+        <w:t xml:space="preserve">Perez De Rosso, S., &amp; Jackson, D. (2013). What's wrong with Git? A conceptual design analysis. En </w:t>
+      </w:r>
+      <w:r>
+        <w:rPr>
+          <w:rFonts w:ascii="Times New Roman" w:hAnsi="Times New Roman"/>
+          <w:i/>
+          <w:sz w:val="24"/>
+        </w:rPr>
+        <w:t>Proceedings of the 2013 ACM International Symposium on New Ideas, New Paradigms, and Reflections on Programming &amp; Software</w:t>
+      </w:r>
+      <w:r>
+        <w:rPr>
+          <w:rFonts w:ascii="Times New Roman" w:hAnsi="Times New Roman"/>
+          <w:sz w:val="24"/>
+        </w:rPr>
+        <w:t xml:space="preserve"> (Onward! 2013) (pp. 37-52). Association for Computing Machinery. https://doi.org/10.1145/2509578.2509584</w:t>
+      </w:r>
+    </w:p>
+    <w:p>
+      <w:pPr>
+        <w:spacing w:line="240" w:lineRule="auto" w:after="120" w:before="0"/>
+      </w:pPr>
+      <w:r>
+        <w:rPr>
+          <w:rFonts w:ascii="Times New Roman" w:hAnsi="Times New Roman"/>
+          <w:sz w:val="24"/>
+        </w:rPr>
         <w:t xml:space="preserve">Shute, V. J. (2008). Focus on formative feedback. </w:t>
       </w:r>
       <w:r>
@@ -3692,6 +3892,33 @@
           <w:sz w:val="24"/>
         </w:rPr>
         <w:t>(1), 153-189. https://doi.org/10.3102/0034654307313795</w:t>
+      </w:r>
+    </w:p>
+    <w:p>
+      <w:pPr>
+        <w:spacing w:line="240" w:lineRule="auto" w:after="120" w:before="0"/>
+      </w:pPr>
+      <w:r>
+        <w:rPr>
+          <w:rFonts w:ascii="Times New Roman" w:hAnsi="Times New Roman"/>
+          <w:sz w:val="24"/>
+        </w:rPr>
+        <w:t xml:space="preserve">Sweller, J. (1988). Cognitive load during problem solving: Effects on learning. </w:t>
+      </w:r>
+      <w:r>
+        <w:rPr>
+          <w:rFonts w:ascii="Times New Roman" w:hAnsi="Times New Roman"/>
+          <w:i/>
+          <w:sz w:val="24"/>
+        </w:rPr>
+        <w:t>Cognitive Science, 12</w:t>
+      </w:r>
+      <w:r>
+        <w:rPr>
+          <w:rFonts w:ascii="Times New Roman" w:hAnsi="Times New Roman"/>
+          <w:sz w:val="24"/>
+        </w:rPr>
+        <w:t>(2), 257-285. https://doi.org/10.1207/s15516709cog1202_4</w:t>
       </w:r>
     </w:p>
     <w:p>

</xml_diff>